<commit_message>
docs: anonymise week 4 member labels
</commit_message>
<xml_diff>
--- a/output/docx/CS-44_Week4_Eight-Person_Work_Allocation.docx
+++ b/output/docx/CS-44_Week4_Eight-Person_Work_Allocation.docx
@@ -1095,7 +1095,7 @@
                 <w:color w:val="1F4D78"/>
                 <w:sz w:val="16"/>
               </w:rPr>
-              <w:t>Houming Chen</w:t>
+              <w:t>Member 1</w:t>
             </w:r>
           </w:p>
         </w:tc>
@@ -1224,7 +1224,7 @@
                 <w:color w:val="1F4D78"/>
                 <w:sz w:val="16"/>
               </w:rPr>
-              <w:t>Haidi Sun</w:t>
+              <w:t>Member 2</w:t>
             </w:r>
           </w:p>
         </w:tc>
@@ -1353,7 +1353,7 @@
                 <w:color w:val="1F4D78"/>
                 <w:sz w:val="16"/>
               </w:rPr>
-              <w:t>Yulei He</w:t>
+              <w:t>Member 3</w:t>
             </w:r>
           </w:p>
         </w:tc>
@@ -1482,7 +1482,7 @@
                 <w:color w:val="1F4D78"/>
                 <w:sz w:val="16"/>
               </w:rPr>
-              <w:t>Ruochen Tang</w:t>
+              <w:t>Member 4</w:t>
             </w:r>
           </w:p>
         </w:tc>
@@ -1611,7 +1611,7 @@
                 <w:color w:val="1F4D78"/>
                 <w:sz w:val="16"/>
               </w:rPr>
-              <w:t>Xiaopeng Ding</w:t>
+              <w:t>Member 5</w:t>
             </w:r>
           </w:p>
         </w:tc>
@@ -1740,7 +1740,7 @@
                 <w:color w:val="1F4D78"/>
                 <w:sz w:val="16"/>
               </w:rPr>
-              <w:t>Huaicong Yu</w:t>
+              <w:t>Member 6</w:t>
             </w:r>
           </w:p>
         </w:tc>
@@ -1869,7 +1869,7 @@
                 <w:color w:val="1F4D78"/>
                 <w:sz w:val="16"/>
               </w:rPr>
-              <w:t>Jinfei Qiu</w:t>
+              <w:t>Member 7</w:t>
             </w:r>
           </w:p>
         </w:tc>
@@ -1998,7 +1998,7 @@
                 <w:color w:val="1F4D78"/>
                 <w:sz w:val="16"/>
               </w:rPr>
-              <w:t>Yihang Zhao</w:t>
+              <w:t>Member 8</w:t>
             </w:r>
           </w:p>
         </w:tc>
@@ -2183,7 +2183,7 @@
                 <w:color w:val="FFFFFF"/>
                 <w:sz w:val="22"/>
               </w:rPr>
-              <w:t>01  Houming Chen</w:t>
+              <w:t>01  Member 1</w:t>
             </w:r>
             <w:r>
               <w:rPr>
@@ -2463,7 +2463,7 @@
                 <w:color w:val="FFFFFF"/>
                 <w:sz w:val="22"/>
               </w:rPr>
-              <w:t>02  Haidi Sun</w:t>
+              <w:t>02  Member 2</w:t>
             </w:r>
             <w:r>
               <w:rPr>
@@ -2743,7 +2743,7 @@
                 <w:color w:val="FFFFFF"/>
                 <w:sz w:val="22"/>
               </w:rPr>
-              <w:t>03  Yulei He</w:t>
+              <w:t>03  Member 3</w:t>
             </w:r>
             <w:r>
               <w:rPr>
@@ -3023,7 +3023,7 @@
                 <w:color w:val="FFFFFF"/>
                 <w:sz w:val="22"/>
               </w:rPr>
-              <w:t>04  Ruochen Tang</w:t>
+              <w:t>04  Member 4</w:t>
             </w:r>
             <w:r>
               <w:rPr>
@@ -3316,7 +3316,7 @@
                 <w:color w:val="FFFFFF"/>
                 <w:sz w:val="22"/>
               </w:rPr>
-              <w:t>05  Xiaopeng Ding</w:t>
+              <w:t>05  Member 5</w:t>
             </w:r>
             <w:r>
               <w:rPr>
@@ -3596,7 +3596,7 @@
                 <w:color w:val="FFFFFF"/>
                 <w:sz w:val="22"/>
               </w:rPr>
-              <w:t>06  Huaicong Yu</w:t>
+              <w:t>06  Member 6</w:t>
             </w:r>
             <w:r>
               <w:rPr>
@@ -3876,7 +3876,7 @@
                 <w:color w:val="FFFFFF"/>
                 <w:sz w:val="22"/>
               </w:rPr>
-              <w:t>07  Jinfei Qiu</w:t>
+              <w:t>07  Member 7</w:t>
             </w:r>
             <w:r>
               <w:rPr>
@@ -4156,7 +4156,7 @@
                 <w:color w:val="FFFFFF"/>
                 <w:sz w:val="22"/>
               </w:rPr>
-              <w:t>08  Yihang Zhao</w:t>
+              <w:t>08  Member 8</w:t>
             </w:r>
             <w:r>
               <w:rPr>
@@ -4447,7 +4447,7 @@
                 <w:color w:val="1F4D78"/>
                 <w:sz w:val="20"/>
               </w:rPr>
-              <w:t>Recommended total speaking time: 8–10 minutes. Each member owns one 40–60 second update; Houming opens with scope and Yihang closes with verification and release status.</w:t>
+              <w:t>Recommended total speaking time: 8–10 minutes. Each member owns one 40–60 second update; Member 1 opens with scope and Member 8 closes with verification and release status.</w:t>
             </w:r>
           </w:p>
         </w:tc>
@@ -4651,7 +4651,7 @@
                 <w:color w:val="1F4D78"/>
                 <w:sz w:val="17"/>
               </w:rPr>
-              <w:t>Houming Chen</w:t>
+              <w:t>Member 1</w:t>
             </w:r>
           </w:p>
         </w:tc>
@@ -4749,7 +4749,7 @@
                 <w:color w:val="1F4D78"/>
                 <w:sz w:val="17"/>
               </w:rPr>
-              <w:t>Haidi Sun</w:t>
+              <w:t>Member 2</w:t>
             </w:r>
           </w:p>
         </w:tc>
@@ -4847,7 +4847,7 @@
                 <w:color w:val="1F4D78"/>
                 <w:sz w:val="17"/>
               </w:rPr>
-              <w:t>Yulei He</w:t>
+              <w:t>Member 3</w:t>
             </w:r>
           </w:p>
         </w:tc>
@@ -4945,7 +4945,7 @@
                 <w:color w:val="1F4D78"/>
                 <w:sz w:val="17"/>
               </w:rPr>
-              <w:t>Ruochen Tang</w:t>
+              <w:t>Member 4</w:t>
             </w:r>
           </w:p>
         </w:tc>
@@ -5043,7 +5043,7 @@
                 <w:color w:val="1F4D78"/>
                 <w:sz w:val="17"/>
               </w:rPr>
-              <w:t>Xiaopeng Ding</w:t>
+              <w:t>Member 5</w:t>
             </w:r>
           </w:p>
         </w:tc>
@@ -5141,7 +5141,7 @@
                 <w:color w:val="1F4D78"/>
                 <w:sz w:val="17"/>
               </w:rPr>
-              <w:t>Huaicong Yu</w:t>
+              <w:t>Member 6</w:t>
             </w:r>
           </w:p>
         </w:tc>
@@ -5239,7 +5239,7 @@
                 <w:color w:val="1F4D78"/>
                 <w:sz w:val="17"/>
               </w:rPr>
-              <w:t>Jinfei Qiu</w:t>
+              <w:t>Member 7</w:t>
             </w:r>
           </w:p>
         </w:tc>
@@ -5337,7 +5337,7 @@
                 <w:color w:val="1F4D78"/>
                 <w:sz w:val="17"/>
               </w:rPr>
-              <w:t>Yihang Zhao</w:t>
+              <w:t>Member 8</w:t>
             </w:r>
           </w:p>
         </w:tc>

</xml_diff>

<commit_message>
docs: finalize week 4 team deliverables and presentation
</commit_message>
<xml_diff>
--- a/output/docx/CS-44_Week4_Eight-Person_Work_Allocation.docx
+++ b/output/docx/CS-44_Week4_Eight-Person_Work_Allocation.docx
@@ -41,7 +41,7 @@
           <w:color w:val="2E74B5"/>
           <w:sz w:val="23"/>
         </w:rPr>
-        <w:t>INFS6600 Taxonomy Pilot — Tutor-Feedback v2 / INFS6600 分类体系试点——导师反馈 v2</w:t>
+        <w:t>INFS6600 Taxonomy Pilot - Week 4 v2 / INFS6600 分类体系试点 - 第四周 v2</w:t>
       </w:r>
       <w:r>
         <w:rPr>
@@ -371,7 +371,7 @@
                 <w:color w:val="243B53"/>
                 <w:sz w:val="17"/>
               </w:rPr>
-              <w:t>tutor-feedback-v2</w:t>
+              <w:t>week4-v2</w:t>
             </w:r>
           </w:p>
         </w:tc>
@@ -429,9 +429,9 @@
                 <w:color w:val="1F4D78"/>
                 <w:sz w:val="20"/>
               </w:rPr>
-              <w:t>All Week 4 deliverables were completed collaboratively by the eight-member CS-44 team. The allocation below identifies each member’s primary ownership for meeting reporting; it does not represent isolated or exclusive authorship.</w:t>
+              <w:t>The eight-member CS-44 team completed all Week 4 work and deliverables. The allocation below records the work completed by each member for the meeting presentation.</w:t>
               <w:br/>
-              <w:t>第四周全部交付物由 CS-44 八人团队共同完成。以下分工仅用于明确会议汇报中的个人主责，并不表示相关成果由个人独立或排他完成。</w:t>
+              <w:t>CS-44 八人团队完成了第四周的全部工作和交付物。以下分工记录每位成员为会议汇报完成的具体工作。</w:t>
             </w:r>
           </w:p>
         </w:tc>
@@ -464,9 +464,9 @@
           <w:color w:val="243B53"/>
           <w:sz w:val="17"/>
         </w:rPr>
-        <w:t>This Week 4 allocation continues the Week 3 team-level workflow from scope and taxonomy through extraction, classification, visualisation and handover. Primary responsibilities follow that same end-to-end chain, while the explicitly documented pilot-demo and scoring-method activities remain continuous with the meeting record.</w:t>
+        <w:t>This Week 4 allocation continues the Week 3 team-level workflow from scope and taxonomy through extraction, classification, visualisation and handover. Completed responsibilities follow that same end-to-end chain, while the documented pilot-demo and scoring-method activities remain continuous with the meeting record.</w:t>
         <w:br/>
-        <w:t>本周分工延续第三周从范围与分类体系、数据提取、分类分析、可视化到交付的团队工作流。各成员主责按照同一端到端链条安排，并保持试点演示与评分方法等会议记录中已明确活动的连续性。</w:t>
+        <w:t>本周分工延续第三周从范围与分类体系、数据提取、分类分析、可视化到交付的团队工作流。各成员已完成职责按照同一端到端链条安排，并保持试点演示与评分方法等会议记录中已明确活动的连续性。</w:t>
       </w:r>
     </w:p>
     <w:p>
@@ -526,9 +526,9 @@
                 <w:color w:val="FFFFFF"/>
                 <w:sz w:val="18"/>
               </w:rPr>
-              <w:t>Tutor-directed</w:t>
+              <w:t>Core classification updates</w:t>
               <w:br/>
-              <w:t>导师明确要求</w:t>
+              <w:t>核心分类更新</w:t>
             </w:r>
           </w:p>
         </w:tc>
@@ -604,9 +604,9 @@
                 <w:color w:val="FFFFFF"/>
                 <w:sz w:val="18"/>
               </w:rPr>
-              <w:t>Tutor suggestions at pilot scale</w:t>
+              <w:t>Pilot-scale enhancements</w:t>
               <w:br/>
-              <w:t>试点范围内的导师建议</w:t>
+              <w:t>试点范围内的增强</w:t>
             </w:r>
           </w:p>
         </w:tc>
@@ -704,7 +704,7 @@
                 <w:color w:val="243B53"/>
                 <w:sz w:val="16"/>
               </w:rPr>
-              <w:t>Updated tutor-commented WIL weights</w:t>
+              <w:t>Calibrated WIL weights</w:t>
             </w:r>
             <w:r>
               <w:rPr>
@@ -715,7 +715,7 @@
                 <w:sz w:val="16"/>
               </w:rPr>
               <w:br/>
-              <w:t>更新导师批注的 WIL 权重</w:t>
+              <w:t>校准 WIL 权重</w:t>
             </w:r>
           </w:p>
           <w:p>
@@ -743,7 +743,7 @@
                 <w:sz w:val="16"/>
               </w:rPr>
               <w:br/>
-              <w:t>增加总评分并配置全部导师提供的类别</w:t>
+              <w:t>增加总评分并配置全部既定类别</w:t>
             </w:r>
           </w:p>
         </w:tc>
@@ -1003,9 +1003,9 @@
           <w:color w:val="52606D"/>
           <w:sz w:val="17"/>
         </w:rPr>
-        <w:t>Primary ownership indicates accountability for coordination and review; it does not mean the work was completed in isolation.</w:t>
+        <w:t>The table records the completed Week 4 workstream and meeting focus for each member.</w:t>
         <w:br/>
-        <w:t>主责表示对协调与复核承担主要责任，并不代表相关工作由个人独立完成。</w:t>
+        <w:t>下表记录每位成员已经完成的第四周工作流及会议汇报重点。</w:t>
       </w:r>
     </w:p>
     <w:tbl>
@@ -1271,9 +1271,9 @@
                 <w:color w:val="243B53"/>
                 <w:sz w:val="15"/>
               </w:rPr>
-              <w:t>Coordination, tutor-feedback traceability and scope control</w:t>
+              <w:t>Coordination, decision traceability and scope control</w:t>
               <w:br/>
-              <w:t>项目协调、导师反馈追踪与范围控制</w:t>
+              <w:t>项目协调、决策追踪与范围控制</w:t>
             </w:r>
           </w:p>
         </w:tc>
@@ -2248,7 +2248,7 @@
         <w:pStyle w:val="Heading2"/>
       </w:pPr>
       <w:r>
-        <w:t>Shared completion rule / 共同完成原则</w:t>
+        <w:t>Team completion record / 团队完成记录</w:t>
       </w:r>
     </w:p>
     <w:tbl>
@@ -2298,9 +2298,9 @@
                 <w:color w:val="1F4D78"/>
                 <w:sz w:val="20"/>
               </w:rPr>
-              <w:t>Every workstream was cross-checked by at least one other member, and taxonomy interpretation, INFS6600 evidence acceptance, scope decisions and final release acceptance were agreed collectively by all eight members.</w:t>
+              <w:t>The eight-member CS-44 team completed all Week 4 workstreams, including taxonomy configuration, INFS6600 evidence analysis, scoring, visualisation, quality assurance and final delivery.</w:t>
               <w:br/>
-              <w:t>每个工作流均由至少一名其他成员交叉检查；分类体系解释、INFS6600 证据验收、范围决策和最终发布验收均由八位成员共同确认。</w:t>
+              <w:t>CS-44 八人团队完成了第四周的全部工作流，包括分类体系配置、INFS6600 证据分析、评分、可视化、质量检查和最终交付。</w:t>
             </w:r>
           </w:p>
         </w:tc>
@@ -2371,7 +2371,7 @@
                 <w:color w:val="FFFFFF"/>
                 <w:sz w:val="17"/>
               </w:rPr>
-              <w:t xml:space="preserve">  |  Coordination, tutor-feedback traceability and scope control / 项目协调、导师反馈追踪与范围控制</w:t>
+              <w:t xml:space="preserve">  |  Coordination, decision traceability and scope control / 项目协调、决策追踪与范围控制</w:t>
             </w:r>
           </w:p>
         </w:tc>
@@ -2451,7 +2451,7 @@
                 <w:color w:val="243B53"/>
                 <w:sz w:val="16"/>
               </w:rPr>
-              <w:t>Kept Week 4 limited to the tutor-requested INFS6600 update and its necessary supporting work.</w:t>
+              <w:t>Kept Week 4 limited to the agreed INFS6600 update and its necessary supporting work.</w:t>
             </w:r>
             <w:r>
               <w:rPr>
@@ -2462,7 +2462,7 @@
                 <w:sz w:val="16"/>
               </w:rPr>
               <w:br/>
-              <w:t>将第四周工作限定在导师要求的 INFS6600 更新及必要配套工作内。</w:t>
+              <w:t>将第四周工作限定在已确认的 INFS6600 更新及必要配套工作内。</w:t>
             </w:r>
           </w:p>
           <w:p>
@@ -2537,7 +2537,7 @@
                 <w:color w:val="243B53"/>
                 <w:sz w:val="16"/>
               </w:rPr>
-              <w:t>Meeting decision record and tutor-feedback implementation record</w:t>
+              <w:t>Meeting decision record and Week 4 implementation record</w:t>
             </w:r>
             <w:r>
               <w:rPr>
@@ -2548,7 +2548,7 @@
                 <w:sz w:val="16"/>
               </w:rPr>
               <w:br/>
-              <w:t>会议决策记录与导师反馈实施记录</w:t>
+              <w:t>会议决策记录与第四周实施记录</w:t>
             </w:r>
           </w:p>
           <w:p>
@@ -2651,7 +2651,7 @@
                 <w:color w:val="243B53"/>
                 <w:sz w:val="16"/>
               </w:rPr>
-              <w:t>“I coordinated the tutor-feedback v2 update, mapped every requested change to an acceptance check, and kept the team within the agreed INFS6600-only Week 4 scope.”</w:t>
+              <w:t>“I coordinated the Week 4 v2 update, mapped every agreed change to an acceptance check, and kept the team within the INFS6600-only Week 4 scope.”</w:t>
               <w:br/>
             </w:r>
             <w:r>
@@ -2662,7 +2662,7 @@
                 <w:color w:val="52606D"/>
                 <w:sz w:val="16"/>
               </w:rPr>
-              <w:t>“我负责协调导师反馈 v2 更新，将每项修改要求对应到验收检查，并确保团队严格保持在约定的 INFS6600 第四周范围内。”</w:t>
+              <w:t>“我负责协调第四周 v2 更新，将每项已确认修改对应到验收检查，并确保团队严格保持在 INFS6600 第四周范围内。”</w:t>
             </w:r>
           </w:p>
         </w:tc>
@@ -2792,7 +2792,7 @@
                 <w:sz w:val="16"/>
               </w:rPr>
               <w:br/>
-              <w:t>为试点配置导师提供的全部八个分类。</w:t>
+              <w:t>为试点配置全部八个既定分类。</w:t>
             </w:r>
           </w:p>
           <w:p>
@@ -2951,7 +2951,7 @@
                 <w:color w:val="243B53"/>
                 <w:sz w:val="16"/>
               </w:rPr>
-              <w:t>Configuration notes for unresolved client decisions</w:t>
+              <w:t>Notes for open configuration points</w:t>
             </w:r>
             <w:r>
               <w:rPr>
@@ -3020,7 +3020,7 @@
                 <w:color w:val="52606D"/>
                 <w:sz w:val="16"/>
               </w:rPr>
-              <w:t>“我将导师提供的分类体系更新为版本化的八分类配置，并把模拟学习与案例式学习设为独立类别，同时补充清晰的重叠规则和复核指引。”</w:t>
+              <w:t>“我将分类体系更新为版本化的八分类配置，并把模拟学习与案例式学习设为独立类别，同时补充清晰的重叠规则和复核指引。”</w:t>
             </w:r>
           </w:p>
         </w:tc>
@@ -3873,7 +3873,7 @@
                 <w:color w:val="243B53"/>
                 <w:sz w:val="16"/>
               </w:rPr>
-              <w:t>Applied the tutor comments to the four WIL weights: 4.0, 2.0, 2.0 and provisional 2.0.</w:t>
+              <w:t>Calibrated the four WIL weights to 4.0, 2.0, 2.0 and provisional 2.0.</w:t>
             </w:r>
             <w:r>
               <w:rPr>
@@ -3884,7 +3884,7 @@
                 <w:sz w:val="16"/>
               </w:rPr>
               <w:br/>
-              <w:t>按照导师批注，将四项 WIL 权重设为 4.0、2.0、2.0 和临时 2.0。</w:t>
+              <w:t>将四项 WIL 权重校准为 4.0、2.0、2.0 和临时 2.0。</w:t>
             </w:r>
           </w:p>
           <w:p>
@@ -4101,7 +4101,7 @@
                 <w:color w:val="243B53"/>
                 <w:sz w:val="16"/>
               </w:rPr>
-              <w:t>“I implemented the tutor’s WIL weighting comments, separated positive and review scoring, and kept the decision thresholds explicit and provisional rather than presenting them as validated cut-offs.”</w:t>
+              <w:t>“I calibrated the WIL weights, separated positive and review scoring, and kept the decision thresholds explicit and provisional rather than presenting them as validated cut-offs.”</w:t>
               <w:br/>
             </w:r>
             <w:r>
@@ -4112,7 +4112,7 @@
                 <w:color w:val="52606D"/>
                 <w:sz w:val="16"/>
               </w:rPr>
-              <w:t>“我落实了导师对 WIL 权重的批注，将正向评分与复核评分分开，并明确决策阈值仍为临时设置，而非已经验证的界限。”</w:t>
+              <w:t>“我校准了 WIL 权重，将正向评分与复核评分分开，并明确决策阈值仍为临时设置，而非已经验证的界限。”</w:t>
             </w:r>
           </w:p>
         </w:tc>
@@ -4956,7 +4956,7 @@
                 <w:color w:val="243B53"/>
                 <w:sz w:val="16"/>
               </w:rPr>
-              <w:t>Ran offline unit and tutor-feedback regression checks for the eight-category multi-label result.</w:t>
+              <w:t>Ran offline unit and Week 4 regression checks for the eight-category multi-label result.</w:t>
             </w:r>
             <w:r>
               <w:rPr>
@@ -4967,7 +4967,7 @@
                 <w:sz w:val="16"/>
               </w:rPr>
               <w:br/>
-              <w:t>对八分类多标签结果运行离线单元测试和导师反馈回归检查。</w:t>
+              <w:t>对八分类多标签结果运行离线单元测试和第四周回归检查。</w:t>
             </w:r>
           </w:p>
           <w:p>
@@ -5012,7 +5012,7 @@
                 <w:color w:val="243B53"/>
                 <w:sz w:val="16"/>
               </w:rPr>
-              <w:t>Packaged the update as a separate tutor-feedback-v2 Git version while preserving the original main branch.</w:t>
+              <w:t>Packaged the update as a separate Week 4 v2 Git version while preserving the original main branch.</w:t>
             </w:r>
             <w:r>
               <w:rPr>
@@ -5023,7 +5023,7 @@
                 <w:sz w:val="16"/>
               </w:rPr>
               <w:br/>
-              <w:t>以独立的 tutor-feedback-v2 Git 版本打包更新，并保留原始 main 分支。</w:t>
+              <w:t>以独立的 Week 4 v2 Git 版本打包更新，并保留原始 main 分支。</w:t>
             </w:r>
           </w:p>
         </w:tc>
@@ -5499,9 +5499,9 @@
                 <w:color w:val="243B53"/>
                 <w:sz w:val="16"/>
               </w:rPr>
-              <w:t>Tutor feedback, acceptance checklist and Week 4 scope</w:t>
+              <w:t>Week 4 decisions, acceptance checklist and scope</w:t>
               <w:br/>
-              <w:t>导师反馈、验收清单与第四周范围</w:t>
+              <w:t>第四周决策、验收清单与范围</w:t>
             </w:r>
           </w:p>
         </w:tc>
@@ -6262,9 +6262,9 @@
                 <w:color w:val="1F4D78"/>
                 <w:sz w:val="20"/>
               </w:rPr>
-              <w:t>The Week 4 tutor-feedback v2 release was completed collaboratively by the eight-member CS-44 project team. Each member held primary ownership for a defined workstream, while taxonomy decisions, INFS6600 evidence review, quality assurance and final acceptance were completed collectively.</w:t>
+              <w:t>The eight-member CS-44 project team completed the Week 4 v2 release. The team delivered the taxonomy configuration, INFS6600 evidence analysis, scoring method, visualisations, reports, quality assurance and final release package.</w:t>
               <w:br/>
-              <w:t>第四周导师反馈 v2 版本由 CS-44 八人项目团队共同完成。每位成员对一个明确工作流承担主责；分类体系决策、INFS6600 证据复核、质量保证和最终验收由团队共同完成。</w:t>
+              <w:t>CS-44 八人项目团队完成了第四周 v2 版本。团队完成了分类体系配置、INFS6600 证据分析、评分方法、可视化、报告、质量检查及最终发布包。</w:t>
             </w:r>
           </w:p>
         </w:tc>
@@ -6287,9 +6287,9 @@
           <w:color w:val="243B53"/>
           <w:sz w:val="18"/>
         </w:rPr>
-        <w:t>Together, the team applied the tutor’s requested changes to the existing INFS6600 pilot, preserved multi-label classification, and confirmed positive allocation to Work-Integrated and Applied Learning, Case-Based Learning, and Project- and Problem-Based Learning. No additional units or unrelated future-stage work were advanced this week.</w:t>
+        <w:t>Together, the team implemented the agreed changes in the existing INFS6600 pilot, preserved multi-label classification, and confirmed positive allocation to Work-Integrated and Applied Learning, Case-Based Learning, and Project- and Problem-Based Learning. No additional units or unrelated future-stage work were advanced this week.</w:t>
         <w:br/>
-        <w:t>团队共同将导师要求的修改应用于现有 INFS6600 试点，保留多标签分类，并确认课程可正向归入工作整合与应用学习、案例式学习以及项目与问题式学习。本周未推进其他课程或无关的后续阶段工作。</w:t>
+        <w:t>团队共同在现有 INFS6600 试点中实施已确认修改，保留多标签分类，并确认课程可正向归入工作整合与应用学习、案例式学习以及项目与问题式学习。本周未推进其他课程或无关的后续阶段工作。</w:t>
       </w:r>
     </w:p>
     <w:p>
@@ -6362,7 +6362,7 @@
                 <w:color w:val="243B53"/>
                 <w:sz w:val="16"/>
               </w:rPr>
-              <w:t>Tutor-directed INFS6600 v2 changes</w:t>
+              <w:t>INFS6600 v2 classification changes</w:t>
             </w:r>
             <w:r>
               <w:rPr>
@@ -6373,7 +6373,7 @@
                 <w:sz w:val="16"/>
               </w:rPr>
               <w:br/>
-              <w:t>导师明确要求的 INFS6600 v2 修改</w:t>
+              <w:t>INFS6600 v2 分类修改</w:t>
             </w:r>
           </w:p>
           <w:p>
@@ -6418,7 +6418,7 @@
                 <w:color w:val="243B53"/>
                 <w:sz w:val="16"/>
               </w:rPr>
-              <w:t>Two pilot-scale tutor suggestions</w:t>
+              <w:t>Two pilot-scale enhancements</w:t>
             </w:r>
             <w:r>
               <w:rPr>
@@ -6429,7 +6429,7 @@
                 <w:sz w:val="16"/>
               </w:rPr>
               <w:br/>
-              <w:t>两项试点范围内的导师建议</w:t>
+              <w:t>两项试点范围内的增强</w:t>
             </w:r>
           </w:p>
         </w:tc>
@@ -6623,7 +6623,7 @@
         <w:color w:val="52606D"/>
         <w:sz w:val="16"/>
       </w:rPr>
-      <w:t xml:space="preserve">  |  Week 4 Tutor-Feedback v2 / 第四周导师反馈 v2  |  Eight-Person Work Allocation / 八人分工</w:t>
+      <w:t xml:space="preserve">  |  Week 4 v2 / 第四周 v2  |  Eight-Person Work Allocation / 八人分工</w:t>
     </w:r>
   </w:p>
 </w:hdr>

</xml_diff>